<commit_message>
Finalise report: faculty, date and team contributions
Co-Authored-By: Claude Sonnet 5.5 <noreply@anthropic.com>
Claude-Session: https://claude.ai/code/session_019HCJPsjVCH2GwAdJJm1zcq
</commit_message>
<xml_diff>
--- a/docs/DAA_Project_Report.docx
+++ b/docs/DAA_Project_Report.docx
@@ -18861,7 +18861,7 @@
           <w:sz w:val="24"/>
           <w:szCs w:val="24"/>
         </w:rPr>
-        <w:t xml:space="preserve">[Draft placeholder. The team should fill in the contribution of each member before submission.]</w:t>
+        <w:t xml:space="preserve">Each member owned one area end to end, wrote its code and tests, and can explain it in the viva. All members reviewed the full pipeline and the results.</w:t>
       </w:r>
     </w:p>
     <w:tbl>
@@ -19081,7 +19081,7 @@
                 <w:sz w:val="21"/>
                 <w:szCs w:val="21"/>
               </w:rPr>
-              <w:t xml:space="preserve">[to be filled in]</w:t>
+              <w:t xml:space="preserve">Project lead. Graph model and CSV data loader, main.py pipeline, Held-Karp exact TSP, integration, GitHub repository, final review deck.</w:t>
             </w:r>
           </w:p>
         </w:tc>
@@ -19182,7 +19182,7 @@
                 <w:sz w:val="21"/>
                 <w:szCs w:val="21"/>
               </w:rPr>
-              <w:t xml:space="preserve">[to be filled in]</w:t>
+              <w:t xml:space="preserve">Minimum spanning tree: Prim and Kruskal with union-find, their tests and cross-checks. Literature survey section of the report.</w:t>
             </w:r>
           </w:p>
         </w:tc>
@@ -19283,7 +19283,7 @@
                 <w:sz w:val="21"/>
                 <w:szCs w:val="21"/>
               </w:rPr>
-              <w:t xml:space="preserve">[to be filled in]</w:t>
+              <w:t xml:space="preserve">Shortest paths: Dijkstra, Bellman-Ford and Floyd-Warshall with path reconstruction, their tests. Empirical runtime benchmark.</w:t>
             </w:r>
           </w:p>
         </w:tc>
@@ -19384,7 +19384,7 @@
                 <w:sz w:val="21"/>
                 <w:szCs w:val="21"/>
               </w:rPr>
-              <w:t xml:space="preserve">[to be filled in]</w:t>
+              <w:t xml:space="preserve">Greedy interval scheduling for driver shifts and 0-1 knapsack dynamic programming for vehicle loading, with brute-force tests.</w:t>
             </w:r>
           </w:p>
         </w:tc>
@@ -19485,7 +19485,7 @@
                 <w:sz w:val="21"/>
                 <w:szCs w:val="21"/>
               </w:rPr>
-              <w:t xml:space="preserve">[to be filled in]</w:t>
+              <w:t xml:space="preserve">Wait-time model, fleet-size sensitivity, nearest-neighbour and MST-preorder tours, interactive dashboard, presentation script and viva preparation.</w:t>
             </w:r>
           </w:p>
         </w:tc>

</xml_diff>

<commit_message>
Point links to renamed repo DAA_PBL
Co-Authored-By: Claude Sonnet 5.5 <noreply@anthropic.com>
Claude-Session: https://claude.ai/code/session_019HCJPsjVCH2GwAdJJm1zcq
</commit_message>
<xml_diff>
--- a/docs/DAA_Project_Report.docx
+++ b/docs/DAA_Project_Report.docx
@@ -756,7 +756,7 @@
           <w:sz w:val="24"/>
           <w:szCs w:val="24"/>
         </w:rPr>
-        <w:t xml:space="preserve">Faculty / Course instructor: [to be filled in]</w:t>
+        <w:t xml:space="preserve">Faculty / Course instructor: Dr. Syed Javeed Pasha</w:t>
       </w:r>
     </w:p>
     <w:p>
@@ -770,7 +770,7 @@
           <w:sz w:val="24"/>
           <w:szCs w:val="24"/>
         </w:rPr>
-        <w:t xml:space="preserve">Date of submission: [to be filled in]</w:t>
+        <w:t xml:space="preserve">Date of submission: 13-10-2026</w:t>
       </w:r>
     </w:p>
     <w:p>

</xml_diff>

<commit_message>
Fix test count (204), remove stale Plotly/networkx mentions, update repo links in report, deck and notebook
</commit_message>
<xml_diff>
--- a/docs/DAA_Project_Report.docx
+++ b/docs/DAA_Project_Report.docx
@@ -784,7 +784,7 @@
           <w:sz w:val="22"/>
           <w:szCs w:val="22"/>
         </w:rPr>
-        <w:t xml:space="preserve">Source code: github.com/ritheekyadav01-afk/daa-campus-shuttle</w:t>
+        <w:t xml:space="preserve">Source code: github.com/ritheekyadav01-afk/DAA_PBL</w:t>
       </w:r>
     </w:p>
     <w:p>
@@ -834,7 +834,7 @@
           <w:sz w:val="24"/>
           <w:szCs w:val="24"/>
         </w:rPr>
-        <w:t xml:space="preserve">Every algorithm is implemented from scratch in Python, documented with its time and space complexity, and cross-checked against a second method. A suite of 202 automated tests passes. On the study data, the average passenger wait falls from </w:t>
+        <w:t xml:space="preserve">Every algorithm is implemented from scratch in Python, documented with its time and space complexity, and cross-checked against a second method. A suite of 204 automated tests passes. On the study data, the average passenger wait falls from </w:t>
       </w:r>
       <w:r>
         <w:rPr>
@@ -4736,7 +4736,7 @@
           <w:sz w:val="24"/>
           <w:szCs w:val="24"/>
         </w:rPr>
-        <w:t xml:space="preserve">Python 3 with matplotlib, networkx, numpy and plotly for charts and the dashboard, and pytest for testing (requirements.txt). The algorithms themselves use only the Python standard library (heapq for the priority queue).</w:t>
+        <w:t xml:space="preserve">Python 3 with matplotlib and numpy for charts, pytest for testing (requirements.txt), and plain HTML, CSS, SVG and JavaScript for the dashboard (no external libraries). The algorithms themselves use only the Python standard library (heapq for the priority queue).</w:t>
       </w:r>
     </w:p>
     <w:p>
@@ -5778,7 +5778,7 @@
                 <w:sz w:val="21"/>
                 <w:szCs w:val="21"/>
               </w:rPr>
-              <w:t xml:space="preserve">Interactive Plotly dashboard (map, route selector, tour comparison, sensitivity).</w:t>
+              <w:t xml:space="preserve">Interactive dashboard in plain HTML, CSS and JavaScript (guided story, route planner, fleet-size slider, before-and-after result).</w:t>
             </w:r>
           </w:p>
         </w:tc>
@@ -5847,7 +5847,7 @@
                 <w:sz w:val="21"/>
                 <w:szCs w:val="21"/>
               </w:rPr>
-              <w:t xml:space="preserve">Randomised and brute-force cross-check tests (202 test cases).</w:t>
+              <w:t xml:space="preserve">Randomised and brute-force cross-check tests (204 test cases).</w:t>
             </w:r>
           </w:p>
         </w:tc>
@@ -8006,7 +8006,7 @@
           <w:sz w:val="19"/>
           <w:szCs w:val="19"/>
         </w:rPr>
-        <w:t xml:space="preserve">daa-campus-shuttle/</w:t>
+        <w:t xml:space="preserve">DAA_PBL/</w:t>
       </w:r>
     </w:p>
     <w:p>
@@ -8054,7 +8054,7 @@
           <w:sz w:val="19"/>
           <w:szCs w:val="19"/>
         </w:rPr>
-        <w:t xml:space="preserve">  requirements.txt       matplotlib, networkx, numpy, plotly, pytest</w:t>
+        <w:t xml:space="preserve">  requirements.txt       matplotlib, numpy, pytest</w:t>
       </w:r>
     </w:p>
     <w:p>
@@ -8102,7 +8102,7 @@
           <w:sz w:val="19"/>
           <w:szCs w:val="19"/>
         </w:rPr>
-        <w:t xml:space="preserve">  tests/                 202 automated tests</w:t>
+        <w:t xml:space="preserve">  tests/                 204 automated tests</w:t>
       </w:r>
     </w:p>
     <w:p>
@@ -8204,7 +8204,7 @@
           <w:sz w:val="19"/>
           <w:szCs w:val="19"/>
         </w:rPr>
-        <w:t xml:space="preserve">pytest -q                 # runs the 202 tests</w:t>
+        <w:t xml:space="preserve">pytest -q                 # runs the 204 tests</w:t>
       </w:r>
     </w:p>
     <w:p>
@@ -8240,7 +8240,7 @@
           <w:sz w:val="24"/>
           <w:szCs w:val="24"/>
         </w:rPr>
-        <w:t xml:space="preserve">main.py generates report/dashboard.html, a self-contained Plotly page showing the campus map on real coordinates, a selectable route (Dijkstra shortest path), the minimum spanning tree, the tour comparison, the before-and-after wait, the fleet sensitivity and the list of assumptions. It opens in any browser without a server.</w:t>
+        <w:t xml:space="preserve">main.py generates report/dashboard.html, a self-contained page (plain HTML, CSS, SVG and JavaScript) that tells the project story in six screens: the problem, the four solution steps, a trip planner (Dijkstra shortest path) with a fleet-size slider, the before-and-after wait, and an honest note on tests and assumptions. It opens in any browser without a server.</w:t>
       </w:r>
     </w:p>
     <w:p>
@@ -13526,7 +13526,7 @@
           <w:sz w:val="24"/>
           <w:szCs w:val="24"/>
         </w:rPr>
-        <w:t xml:space="preserve">The test suite (tests/test_algorithms.py) contains 202 test cases and all pass. Four of the tests are parametrised over 50 random seeds (200 cases) and two are single deterministic checks.</w:t>
+        <w:t xml:space="preserve">The test suite (tests/test_algorithms.py) contains 204 test cases and all pass. Four of the tests are parametrised over 50 random seeds (200 cases) and four are single deterministic checks (two on the real campus data and two on the dashboard).</w:t>
       </w:r>
     </w:p>
     <w:tbl>
@@ -14669,7 +14669,7 @@
           <w:sz w:val="24"/>
           <w:szCs w:val="24"/>
         </w:rPr>
-        <w:t xml:space="preserve">Equally important are the engineering habits that make the result trustworthy: each algorithm is cross-checked against another, 202 automated tests pass, complexity is measured as well as derived, and the estimated nature of the inputs is stated wherever the numbers appear. The next step is to replace the estimates with measured campus data.</w:t>
+        <w:t xml:space="preserve">Equally important are the engineering habits that make the result trustworthy: each algorithm is cross-checked against another, 204 automated tests pass, complexity is measured as well as derived, and the estimated nature of the inputs is stated wherever the numbers appear. The next step is to replace the estimates with measured campus data.</w:t>
       </w:r>
     </w:p>
     <w:p>
@@ -18745,7 +18745,7 @@
           <w:sz w:val="19"/>
           <w:szCs w:val="19"/>
         </w:rPr>
-        <w:t xml:space="preserve">git clone https://github.com/ritheekyadav01-afk/daa-campus-shuttle.git</w:t>
+        <w:t xml:space="preserve">git clone https://github.com/ritheekyadav01-afk/DAA_PBL.git</w:t>
       </w:r>
     </w:p>
     <w:p>
@@ -18761,7 +18761,7 @@
           <w:sz w:val="19"/>
           <w:szCs w:val="19"/>
         </w:rPr>
-        <w:t xml:space="preserve">cd daa-campus-shuttle</w:t>
+        <w:t xml:space="preserve">cd DAA_PBL</w:t>
       </w:r>
     </w:p>
     <w:p>
@@ -18825,7 +18825,7 @@
           <w:sz w:val="19"/>
           <w:szCs w:val="19"/>
         </w:rPr>
-        <w:t xml:space="preserve">pytest -q          # 202 passed</w:t>
+        <w:t xml:space="preserve">pytest -q          # 204 passed</w:t>
       </w:r>
     </w:p>
     <w:p>

</xml_diff>